<commit_message>
resume: TypeScript/Node positioning, ContextQA at the pattern level, ratified achievements
Headline and summary lead with TypeScript/Node, backend-strongest, applied AI.
ContextQA is five Node-first bullets (execution engine, integrations engine,
session control plane on GKE, presigned-URL + PR-impact flow, the two shipped
products) with no company metrics or customer names; Java/Python is one clause.
Achievements drop the unverifiable 700+ / CodeChef line. Skills gain an AI row
and a working-exposure row. Still one page (font 8.7pt, 7mm vertical margin),
ATS scan passes, PDF/DOCX/TXT rebuilt from resume.json.
</commit_message>
<xml_diff>
--- a/resume/Shailesh_Chaudhari_Resume.docx
+++ b/resume/Shailesh_Chaudhari_Resume.docx
@@ -13,7 +13,7 @@
     </w:p>
     <w:p>
       <w:r>
-        <w:t>Full-Stack Software Engineer - Backend-Focused</w:t>
+        <w:t>Software Engineer - TypeScript/Node, backend-strongest, applied AI</w:t>
       </w:r>
     </w:p>
     <w:p>
@@ -35,7 +35,7 @@
     </w:p>
     <w:p>
       <w:r>
-        <w:t>Full-stack engineer with 2.5+ years shipping production systems end to end, strongest on the backend: multi-tenant test-execution infrastructure, idempotent webhook pipelines and real-time platforms. Backend in TypeScript/Node.js with PostgreSQL, Redis and Docker; frontend in React and Next.js, including interfaces audited to WCAG 2.1 AA. Focused on correctness: concurrency control, deterministic testing, and verification that asserts real outcomes.</w:t>
+        <w:t>TypeScript/Node full-stack engineer with 2.5+ years shipping production systems end to end: multi-tenant test-execution infrastructure, idempotent webhook pipelines, real-time platforms, and LLM tool-calling agents inside products. Frontend in React/Next.js, audited to WCAG 2.1 AA. Focused on correctness: concurrency control, deterministic testing, and verification that asserts real outcomes.</w:t>
       </w:r>
     </w:p>
     <w:p>
@@ -66,7 +66,7 @@
         <w:pStyle w:val="ListBullet"/>
       </w:pPr>
       <w:r>
-        <w:t>Build the backend of the core QA-automation platform: a test-execution engine orchestrating concurrent runs across Playwright, WebdriverIO and LambdaTest; VNC streaming for live browser-session debugging; and the REST APIs driving run history, assertions and artifacts.</w:t>
+        <w:t>Backend of the core QA-automation platform: a Node.js test-execution engine orchestrating concurrent browser and mobile runs (Playwright, WebdriverIO/Appium, LambdaTest), live browser-session streaming (noVNC) over WebSockets through a Node control plane, and a debug engine with breakpoints and resume-from-checkpoint.</w:t>
       </w:r>
     </w:p>
     <w:p>
@@ -74,7 +74,31 @@
         <w:pStyle w:val="ListBullet"/>
       </w:pPr>
       <w:r>
-        <w:t>Shipped 2 products end to end (React, Next.js, TypeScript, Tailwind + Node.js): Vibe Testing, an AI-assisted UI testing extension streaming live logs over WebSockets, and AxeTos, which audits pages against WCAG A/AA/AAA with precise DOM locators. Both still in use.</w:t>
+        <w:t>Primary author of the integrations engine (Node/TypeScript): GitHub App, GitLab and Linear OAuth, Slack Block Kit bot, webhook ingestion. Made it multi-tenant: OAuth handshake state moved from per-pod memory to Redis with an atomic Lua read-and-delete, tenant resolution by installation id, token vault ciphertext-only at rest.</w:t>
+      </w:r>
+    </w:p>
+    <w:p>
+      <w:pPr>
+        <w:pStyle w:val="ListBullet"/>
+      </w:pPr>
+      <w:r>
+        <w:t>Node session control plane on GKE: pre-warmed pod pool over Redis, idempotent stop with first-terminal-wins status ordering, request trace ids via AsyncLocalStorage, stable error codes and a diagnostics bundle for on-prem customers, pod eviction protection and memory budgeting.</w:t>
+      </w:r>
+    </w:p>
+    <w:p>
+      <w:pPr>
+        <w:pStyle w:val="ListBullet"/>
+      </w:pPr>
+      <w:r>
+        <w:t>Presigned-URL chokepoint so private S3/MinIO/GCS buckets work on-prem; PR-impact analysis flow where a webhook and an MCP tool call share one path. Also contribute to the platform's Java (Spring Boot) and Python services with AI-assisted development.</w:t>
+      </w:r>
+    </w:p>
+    <w:p>
+      <w:pPr>
+        <w:pStyle w:val="ListBullet"/>
+      </w:pPr>
+      <w:r>
+        <w:t>Shipped 2 products end to end (React/Next.js + Node.js): Vibe Testing, an AI-assisted UI-testing extension streaming live logs over WebSockets, and AxeTos, a WCAG A/AA/AAA auditor with precise DOM locators. Both still in use.</w:t>
       </w:r>
     </w:p>
     <w:p>
@@ -93,15 +117,7 @@
         <w:pStyle w:val="ListBullet"/>
       </w:pPr>
       <w:r>
-        <w:t>Delivered 3 client products full-stack in React and Node.js (EdTech scheduling, sign-language e-learning, corporate LMS), all on schedule with zero production incidents.</w:t>
-      </w:r>
-    </w:p>
-    <w:p>
-      <w:pPr>
-        <w:pStyle w:val="ListBullet"/>
-      </w:pPr>
-      <w:r>
-        <w:t>Integrated a third-party scheduling API with a Python/CPLEX optimization service; synchronized large datasets and built the real-time calendar UI in React, backed by AWS S3 file workflows.</w:t>
+        <w:t>Delivered 3 client products full-stack in React and Node.js (EdTech scheduling, sign-language e-learning, corporate LMS), on schedule with zero production incidents; integrated a third-party scheduling API with a Python/CPLEX optimizer, built the real-time calendar UI, and AWS S3 file workflows.</w:t>
       </w:r>
     </w:p>
     <w:p>
@@ -151,7 +167,7 @@
         <w:pStyle w:val="ListBullet"/>
       </w:pPr>
       <w:r>
-        <w:t>Idempotency-guarded reconciliation pipeline: Meta webhook to database-enforced deduplication to LLM function-calling to ledger writes to Tally XML export. Exactly-once effects over an at-least-once delivery channel, enforced by a unique constraint rather than a distributed lock; 8 simultaneous deliveries of the same message produce exactly one ledger write.</w:t>
+        <w:t>Idempotency-guarded reconciliation pipeline: Meta webhook -&gt; DB-enforced deduplication -&gt; LLM function-calling (10 tools) -&gt; ledger writes -&gt; Tally XML export. Exactly-once effects over an at-least-once channel via a unique constraint, not a distributed lock; 8 simultaneous deliveries of one message produce exactly one ledger write.</w:t>
       </w:r>
     </w:p>
     <w:p>
@@ -167,7 +183,7 @@
         <w:pStyle w:val="ListBullet"/>
       </w:pPr>
       <w:r>
-        <w:t>Next.js/React app in three languages (English, Hindi, Gujarati) with locale-aware invoices and GST reporting.</w:t>
+        <w:t>Next.js/React app in three languages (English, Hindi, Gujarati) with locale-aware invoices and GST reporting; bring-your-own Gemini key encrypted at rest (AES-256-GCM).</w:t>
       </w:r>
     </w:p>
     <w:p>
@@ -194,7 +210,7 @@
         <w:pStyle w:val="ListBullet"/>
       </w:pPr>
       <w:r>
-        <w:t>Verified 4 independent ways: 8 invariants, a reference oracle, mutation testing (158 of 165 mutants killed), and a self-verifying shrinker. Found 9 real bugs, about half in the checker rather than the implementation.</w:t>
+        <w:t>Verified 4 independent ways: 8 invariants, a reference oracle, mutation testing (158 of 165 mutants killed, 197 tests), and a self-verifying shrinker. Found 9 real bugs, 4 of them in the checker rather than the implementation.</w:t>
       </w:r>
     </w:p>
     <w:p>
@@ -255,7 +271,7 @@
         <w:t xml:space="preserve">Languages: </w:t>
       </w:r>
       <w:r>
-        <w:t>TypeScript, JavaScript, SQL, C++</w:t>
+        <w:t>TypeScript, JavaScript, SQL, C++ (DSA)</w:t>
       </w:r>
     </w:p>
     <w:p>
@@ -269,7 +285,7 @@
         <w:t xml:space="preserve">Frontend: </w:t>
       </w:r>
       <w:r>
-        <w:t>React, Next.js, Tailwind CSS, shadcn/ui, Redux, responsive UI, accessibility (WCAG 2.1 AA)</w:t>
+        <w:t>React, Next.js, Tailwind CSS, shadcn/ui, accessibility (WCAG 2.1 AA)</w:t>
       </w:r>
     </w:p>
     <w:p>
@@ -283,7 +299,7 @@
         <w:t xml:space="preserve">Backend: </w:t>
       </w:r>
       <w:r>
-        <w:t>Node.js, Express.js, NestJS, REST APIs, Socket.io, Prisma ORM</w:t>
+        <w:t>Node.js, Express, NestJS, Socket.io, Prisma, REST APIs</w:t>
       </w:r>
     </w:p>
     <w:p>
@@ -294,10 +310,10 @@
         <w:rPr>
           <w:b/>
         </w:rPr>
-        <w:t xml:space="preserve">Databases: </w:t>
+        <w:t xml:space="preserve">Data: </w:t>
       </w:r>
       <w:r>
-        <w:t>PostgreSQL, Redis, MongoDB (relational and non-relational)</w:t>
+        <w:t>PostgreSQL, Redis, MongoDB</w:t>
       </w:r>
     </w:p>
     <w:p>
@@ -311,7 +327,7 @@
         <w:t xml:space="preserve">Infrastructure: </w:t>
       </w:r>
       <w:r>
-        <w:t>Docker, Docker Compose, GitHub Actions (CI/CD), Vercel, Supabase, AWS S3</w:t>
+        <w:t>Docker / Docker Compose, GitHub Actions (CI/CD), GKE (exposure), Vercel, Supabase, AWS S3</w:t>
       </w:r>
     </w:p>
     <w:p>
@@ -322,10 +338,24 @@
         <w:rPr>
           <w:b/>
         </w:rPr>
-        <w:t xml:space="preserve">Reliability patterns: </w:t>
+        <w:t xml:space="preserve">AI: </w:t>
       </w:r>
       <w:r>
-        <w:t>idempotency, concurrency control, distributed locks, message queues and dead-letter queues, circuit breakers, RBAC, mutation and property-based testing</w:t>
+        <w:t>LLM function/tool calling (Gemini), multi-model fallback, per-key isolation, bring-your-own-key encryption, evals, MCP tools, pgvector RAG</w:t>
+      </w:r>
+    </w:p>
+    <w:p>
+      <w:pPr>
+        <w:pStyle w:val="ListBullet"/>
+      </w:pPr>
+      <w:r>
+        <w:rPr>
+          <w:b/>
+        </w:rPr>
+        <w:t xml:space="preserve">Working exposure: </w:t>
+      </w:r>
+      <w:r>
+        <w:t>Java (Spring Boot), Python</w:t>
       </w:r>
     </w:p>
     <w:p>
@@ -365,7 +395,7 @@
         <w:pStyle w:val="ListBullet"/>
       </w:pPr>
       <w:r>
-        <w:t>Institute Rank 1 on GeeksforGeeks (604+ problems solved); 700+ DSA problems solved across platforms</w:t>
+        <w:t>Institute Rank 1 on GeeksforGeeks (604+ problems solved)</w:t>
       </w:r>
     </w:p>
     <w:p>
@@ -373,7 +403,7 @@
         <w:pStyle w:val="ListBullet"/>
       </w:pPr>
       <w:r>
-        <w:t>5-star C++ rating on HackerRank; active on CodeChef and LeetCode</w:t>
+        <w:t>5-star C++ on HackerRank</w:t>
       </w:r>
     </w:p>
     <w:p>

</xml_diff>